<commit_message>
MysteryTracker Mobile publishing #72
</commit_message>
<xml_diff>
--- a/Publishing-Strategy.docx
+++ b/Publishing-Strategy.docx
@@ -151,7 +151,7 @@
           <w:b/>
           <w:i w:val="0"/>
         </w:rPr>
-        <w:t>Updated 2026-07-09, session #71.</w:t>
+        <w:t>Updated 2026-07-10, session #72.</w:t>
       </w:r>
       <w:r>
         <w:rPr>
@@ -182,7 +182,7 @@
           <w:b w:val="0"/>
           <w:i w:val="0"/>
         </w:rPr>
-        <w:t>Session #71 (2026-07-09) was a deciding session, all recorded in this doc. THE FOUR-PRODUCT GOAL is now written in (see “The four products — decided”): both apps, web and mobile, all published. The fork is CHOSEN — Mobile first: clean up the mobile app (renamed “Mystery Tracker”, same name as the web version) and take it to the App Store FREE. Every scope decision from #71 lives in Projects → MysteryCluesTracker → docs/upgrade-scope.md — READ THAT FILE before touching the app. The route to the store is decided too: a bare Xcode + WKWebView wrapper (wrap-vs-rebuild research done 2026-07-09, web-verified; Capacitor / Expo+WebView / PWABuilder assessed and passed over — details in upgrade-scope.md). A pointer doc now exists at elderlyassistant/docs/publishing.md. The #70 elyfont.com home-page fix stands, verified live.</w:t>
+        <w:t>Session #72 (2026-07-10) moved the Mystery Tracker mobile effort from decisions into work. Decisions logged in this doc: the Memory WEB version is DROPPED (elyfont.com gets a pointer only — the rich reminder scheme can’t live on the web); the ROLLOUT ORDER is decided (see “Rollout strategy”): Mystery Tracker mobile first as the rehearsal — no money expected, but full polish, it’s advertising — then Memory to the App Store, then Memory on Android after the iPhone build. Setup is COMPLETE: Xcode 26.6 + iOS 26.5 components on the MacBook Air (M5, Tahoe 26.5.2), Apple ID signed into Xcode, Developer account already held. The mechanical cleanup is ALL DONE and Patrick-verified in his browser (eight test turns): renamed to “Mystery Tracker”, voice claim gone, new icon designed and approved (three fanned cards — gold ?, green ✓, red ✗), all paths relative (new root manifest.json + service-worker.js), fonts bundled — zero external URLs, fully offline. A NO-THINKING directive for the mobile app is logged in upgrade-scope.md (Σ purely manual, premium auto-Σ comes OUT, per-turn auto-cross kept as bookkeeping, 🏠 column manual ✓/✗ only). READ upgrade-scope.md before touching the app — it holds every decision and today’s corrections.</w:t>
       </w:r>
     </w:p>
     <w:p>
@@ -206,7 +206,7 @@
           <w:b w:val="0"/>
           <w:i w:val="0"/>
         </w:rPr>
-        <w:t>(1) FIXED (#71) — the sync block and footer now say App-Docs. (2) Still standing: the 266-step test procedure as its own tickable web checklist page (idea Patrick liked, #70). (3) The elyfont.com home card describes Mystery Tracker as a tracker for a mystery you’re READING — the app is actually a board-game companion; reword the card someday. (4) The web app’s guide text has one stray Clue echo (“Plum, Rope and Hall”, ~line 4032 of MysteryTracker.html) — also noted in upgrade-scope.md’s legal-caution section.</w:t>
+        <w:t>(1) COMMITS OWED (Patrick, end of #72): commit BOTH repos — App-Docs and MysteryCluesTracker — and at commit DELETE the three dead files in MysteryCluesTracker: clue-manifest.json, static/clue-icon.png, static/service-worker.js (keep MysteryTracker.html there — it’s Patrick’s original hand-built Clue sheet, a keepsake). (2) Wherever the PWA is currently served, the next upload needs the NEW layout: the app file plus manifest.json, service-worker.js, and static/ (fonts + icons). (3) Still standing: the 266-step test procedure as its own tickable web checklist page (idea Patrick liked, #70). (4) The elyfont.com home card describes Mystery Tracker as a tracker for a mystery you’re READING — the app is actually a board-game companion; reword the card someday. (5) The web app’s guide text has one stray Clue echo (“Plum, Rope and Hall”, ~line 4032 of MysteryTracker.html) — also noted in upgrade-scope.md’s legal-caution section.</w:t>
       </w:r>
     </w:p>
     <w:p>
@@ -230,7 +230,7 @@
           <w:b w:val="0"/>
           <w:i w:val="0"/>
         </w:rPr>
-        <w:t>Standing lesson (#70, keep it): never give click-by-click directions for a screen you cannot see — ask to view the screen first. NEXT GOAL (Patrick, end of #71): begin the Mystery Tracker mobile upgrade “when we are ready.” Start by connecting Projects → MysteryCluesTracker and reading docs/upgrade-scope.md — it holds every decision (scope, name, legal caution, the wrapper route) plus the open first steps: the quick “Clue” grep of in-app text, the mechanical pre-store fixes, and mockups for the configurable setup + new columns. Patrick names the session goal; scope it together; wait for his go.</w:t>
+        <w:t>Standing lesson (#70, keep it — it bit again in #72): never give click-by-click directions for a screen you cannot see — ask to view the screen first. NEXT GOAL (end of #72): the MOCKUPS — configurable setup (1–4 categories, 1–30 cards, player-named), ✓/✗ cell tinting, the 🏠 column (manual marks only), tier-gate removal (auto-Σ comes OUT with it), and the portrait/landscape question. Start by connecting Projects → MysteryCluesTracker and reading docs/upgrade-scope.md. Patrick names the session goal; scope it together; wait for his go.</w:t>
       </w:r>
     </w:p>
     <w:p>
@@ -444,7 +444,7 @@
         <w:t xml:space="preserve">4. Memory — web version. </w:t>
       </w:r>
       <w:r>
-        <w:t xml:space="preserve">Not started.</w:t>
+        <w:t xml:space="preserve">DROPPED (decided 2026-07-10, session #72): no web version. The app is built around the rich reminder scheme, which the web can’t carry. elyfont.com gets a pointer to the App Store listing only.</w:t>
       </w:r>
     </w:p>
     <w:p>
@@ -473,7 +473,7 @@
           <w:i w:val="false"/>
           <w:iCs w:val="false"/>
         </w:rPr>
-        <w:t xml:space="preserve">Clean up Mystery Clues Tracker and take it to the App Store as a free app. Free + no outside-world contact keeps the prep simple — no money mechanics, minimal privacy disclosures. The Memory web version waits its turn. Route decided (#71): a bare Xcode + WKWebView wrapper — research done, details in MysteryCluesTracker/docs/upgrade-scope.md. (The other path was: convert Memory to a web version.)</w:t>
+        <w:t xml:space="preserve">Clean up Mystery Clues Tracker and take it to the App Store as a free app. Free + no outside-world contact keeps the prep simple — no money mechanics, minimal privacy disclosures. Route decided (#71): a bare Xcode + WKWebView wrapper — research done, details in MysteryCluesTracker/docs/upgrade-scope.md. (The other path was: convert Memory to a web version — since dropped entirely, #72.)</w:t>
       </w:r>
     </w:p>
     <w:p>
@@ -481,7 +481,7 @@
         <w:pStyle w:val="Heading2"/>
       </w:pPr>
       <w:r>
-        <w:t xml:space="preserve">Rollout strategy (to plan)</w:t>
+        <w:t xml:space="preserve">Rollout strategy — decided (2026-07-10, session #72)</w:t>
       </w:r>
     </w:p>
     <w:p>
@@ -495,7 +495,21 @@
           <w:i w:val="false"/>
           <w:iCs w:val="false"/>
         </w:rPr>
-        <w:t xml:space="preserve">Plan the order of all four releases to best take advantage of learning as we go. Not yet planned.</w:t>
+        <w:t xml:space="preserve">Mystery Tracker mobile is the rehearsal, nothing more — family disinterest says there’s little to no money in it, and that’s fine; its whole job is to be the practice run for publishing Memory. The order:</w:t>
+      </w:r>
+    </w:p>
+    <w:p>
+      <w:pPr>
+        <w:spacing w:after="140"/>
+      </w:pPr>
+      <w:r>
+        <w:rPr>
+          <w:b w:val="false"/>
+          <w:bCs w:val="false"/>
+          <w:i w:val="false"/>
+          <w:iCs w:val="false"/>
+        </w:rPr>
+        <w:t xml:space="preserve">(1) Mystery Tracker mobile → App Store, free — the rehearsal. No money in it, but it still gets full polish: the best app it can be, looking great — it’s advertising as much as practice. (2) Memory → App Store — the mission. (3) Memory → Android, eventually — at least after the iPhone build; timing and Google’s current fees/requirements to be researched when it matters.</w:t>
       </w:r>
     </w:p>
     <w:p>

</xml_diff>

<commit_message>
MysteryTracker Mobile scope  & mockup #72
</commit_message>
<xml_diff>
--- a/Publishing-Strategy.docx
+++ b/Publishing-Strategy.docx
@@ -148,41 +148,10 @@
       </w:pPr>
       <w:r>
         <w:rPr>
-          <w:b/>
-          <w:i w:val="0"/>
-        </w:rPr>
-        <w:t>Updated 2026-07-10, session #72.</w:t>
-      </w:r>
-      <w:r>
-        <w:rPr>
-          <w:b w:val="0"/>
-          <w:i/>
-        </w:rPr>
-        <w:t xml:space="preserve"> (Claude refreshes this at each session's end.)</w:t>
-      </w:r>
-    </w:p>
-    <w:p>
-      <w:pPr>
-        <w:pStyle w:val="ListParagraph"/>
-        <w:numPr>
-          <w:ilvl w:val="0"/>
-          <w:numId w:val="2"/>
-        </w:numPr>
-        <w:spacing w:after="100"/>
-      </w:pPr>
-      <w:r>
-        <w:rPr>
-          <w:b/>
-          <w:i w:val="0"/>
-        </w:rPr>
-        <w:t xml:space="preserve">Where we are: </w:t>
-      </w:r>
-      <w:r>
-        <w:rPr>
           <w:b w:val="0"/>
           <w:i w:val="0"/>
         </w:rPr>
-        <w:t>Session #72 (2026-07-10) moved the Mystery Tracker mobile effort from decisions into work. Decisions logged in this doc: the Memory WEB version is DROPPED (elyfont.com gets a pointer only — the rich reminder scheme can’t live on the web); the ROLLOUT ORDER is decided (see “Rollout strategy”): Mystery Tracker mobile first as the rehearsal — no money expected, but full polish, it’s advertising — then Memory to the App Store, then Memory on Android after the iPhone build. Setup is COMPLETE: Xcode 26.6 + iOS 26.5 components on the MacBook Air (M5, Tahoe 26.5.2), Apple ID signed into Xcode, Developer account already held. The mechanical cleanup is ALL DONE and Patrick-verified in his browser (eight test turns): renamed to “Mystery Tracker”, voice claim gone, new icon designed and approved (three fanned cards — gold ?, green ✓, red ✗), all paths relative (new root manifest.json + service-worker.js), fonts bundled — zero external URLs, fully offline. A NO-THINKING directive for the mobile app is logged in upgrade-scope.md (Σ purely manual, premium auto-Σ comes OUT, per-turn auto-cross kept as bookkeeping, 🏠 column manual ✓/✗ only). READ upgrade-scope.md before touching the app — it holds every decision and today’s corrections.</w:t>
+        <w:t>Updated 2026-07-10, session #72 (second sitting — scope + mockups). (Claude refreshes this at each session's end.)</w:t>
       </w:r>
     </w:p>
     <w:p>
@@ -199,38 +168,72 @@
           <w:b/>
           <w:i w:val="0"/>
         </w:rPr>
-        <w:t xml:space="preserve">Loose ends: </w:t>
+        <w:t xml:space="preserve">Where we are: </w:t>
       </w:r>
       <w:r>
         <w:rPr>
           <w:b w:val="0"/>
           <w:i w:val="0"/>
         </w:rPr>
-        <w:t>(1) COMMITS OWED (Patrick, end of #72): commit BOTH repos — App-Docs and MysteryCluesTracker — and at commit DELETE the three dead files in MysteryCluesTracker: clue-manifest.json, static/clue-icon.png, static/service-worker.js (keep MysteryTracker.html there — it’s Patrick’s original hand-built Clue sheet, a keepsake). (2) Wherever the PWA is currently served, the next upload needs the NEW layout: the app file plus manifest.json, service-worker.js, and static/ (fonts + icons). (3) Still standing: the 266-step test procedure as its own tickable web checklist page (idea Patrick liked, #70). (4) The elyfont.com home card describes Mystery Tracker as a tracker for a mystery you’re READING — the app is actually a board-game companion; reword the card someday. (5) The web app’s guide text has one stray Clue echo (“Plum, Rope and Hall”, ~line 4032 of MysteryTracker.html) — also noted in upgrade-scope.md’s legal-caution section.</w:t>
-      </w:r>
-    </w:p>
-    <w:p>
-      <w:pPr>
-        <w:pStyle w:val="ListParagraph"/>
-        <w:numPr>
-          <w:ilvl w:val="0"/>
-          <w:numId w:val="2"/>
-        </w:numPr>
-        <w:spacing w:after="100"/>
-      </w:pPr>
-      <w:r>
-        <w:rPr>
-          <w:b/>
-          <w:i w:val="0"/>
-        </w:rPr>
-        <w:t xml:space="preserve">For Claude — read first: </w:t>
-      </w:r>
+        <w:t>Session #72 (2026-07-10) moved the Mystery Tracker mobile effort from decisions into work. Decisions logged in this doc: the Memory WEB version is DROPPED (elyfont.com gets a pointer only — the rich reminder scheme can’t live on the web); the ROLLOUT ORDER is decided (see “Rollout strategy”): Mystery Tracker mobile first as the rehearsal — no money expected, but full polish, it’s advertising — then Memory to the App Store, then Memory on Android after the iPhone build. Setup is COMPLETE: Xcode 26.6 + iOS 26.5 components on the MacBook Air (M5, Tahoe 26.5.2), Apple ID signed into Xcode, Developer account already held. The mechanical cleanup is ALL DONE and Patrick-verified in his browser (eight test turns): renamed to “Mystery Tracker”, voice claim gone, new icon designed and approved (three fanned cards — gold ?, green ✓, red ✗), all paths relative (new root manifest.json + service-worker.js), fonts bundled — zero external URLs, fully offline. A NO-THINKING directive for the mobile app is logged in upgrade-scope.md (Σ purely manual, premium auto-Σ comes OUT, per-turn auto-cross kept as bookkeeping, 🏠 column manual ✓/✗ only). READ upgrade-scope.md before touching the app — it holds every decision and today’s corrections.</w:t>
+      </w:r>
+    </w:p>
+    <w:p>
+      <w:pPr>
+        <w:pStyle w:val="ListParagraph"/>
+        <w:numPr>
+          <w:ilvl w:val="0"/>
+          <w:numId w:val="2"/>
+        </w:numPr>
+        <w:spacing w:after="100"/>
+      </w:pPr>
       <w:r>
         <w:rPr>
           <w:b w:val="0"/>
           <w:i w:val="0"/>
         </w:rPr>
-        <w:t>Standing lesson (#70, keep it — it bit again in #72): never give click-by-click directions for a screen you cannot see — ask to view the screen first. NEXT GOAL (end of #72): the MOCKUPS — configurable setup (1–4 categories, 1–30 cards, player-named), ✓/✗ cell tinting, the 🏠 column (manual marks only), tier-gate removal (auto-Σ comes OUT with it), and the portrait/landscape question. Start by connecting Projects → MysteryCluesTracker and reading docs/upgrade-scope.md. Patrick names the session goal; scope it together; wait for his go.</w:t>
+        <w:t>Also in #72 (second sitting, 2026-07-10): the upgrade SCOPE is now COMPLETE — every design question decided and recorded in upgrade-scope.md. Highlights: 🏠 cell is a blank↔✓ toggle ONLY (no ✗), placement + look mockup-approved; ALL visuals mirror the web where practical (new standing rule); configurable-structure model decided: truly variable, the player shapes it at setup (deliberate exception to mirror-the-web — the web uses a fixed 4×30 grid with muting); band colors: categories 1–3 keep red/blue/green, the 4th takes the web's cat-4 gold; setup-screen design APPROVED as mocked (Add Category button, N-of-30 counter, per-category counts); templates store the whole structure (no migration needed — no saved games exist); minimums: a category may sit empty, deck ≥ 15 cards, 2 players, 2 cards in hand, Me slot required; asks generalize to one card per non-empty category with auto-commit at the Nth pick (as the web does); the asking flow's 2-of-3 auto-check comes OUT (no-thinking); ✓/✗ tinting ports straight from the web, no mockup; LANDSCAPE DEFERRED until the existing product is finished — the upgrade ships portrait-only. Also new: CLAUDE.md + session-start.md now exist in all three project folders (App-Docs, MysteryCluesTracker, elderlyassistant) carrying the standing rules; Patrick's session opener: “#NN — name. Read CLAUDE.md, session-start.md, and the hand-off, then tell me where things stand.”</w:t>
+      </w:r>
+    </w:p>
+    <w:p>
+      <w:pPr>
+        <w:pStyle w:val="ListParagraph"/>
+        <w:numPr>
+          <w:ilvl w:val="0"/>
+          <w:numId w:val="2"/>
+        </w:numPr>
+        <w:spacing w:after="100"/>
+      </w:pPr>
+      <w:r>
+        <w:rPr>
+          <w:b/>
+          <w:i w:val="0"/>
+        </w:rPr>
+        <w:t xml:space="preserve">Loose ends: </w:t>
+      </w:r>
+      <w:r>
+        <w:rPr>
+          <w:b w:val="0"/>
+          <w:i w:val="0"/>
+        </w:rPr>
+        <w:t>(1) COMMITS OWED (Patrick, end of #72): commit BOTH repos — App-Docs and MysteryCluesTracker — and at commit DELETE the three dead files in MysteryCluesTracker: clue-manifest.json, static/clue-icon.png, static/service-worker.js (keep MysteryTracker.html there — it’s Patrick’s original hand-built Clue sheet, a keepsake). (2) Wherever the PWA is currently served, the next upload needs the NEW layout: the app file plus manifest.json, service-worker.js, and static/ (fonts + icons). (3) Still standing: the 266-step test procedure as its own tickable web checklist page (idea Patrick liked, #70). (4) The elyfont.com home card describes Mystery Tracker as a tracker for a mystery you’re READING — the app is actually a board-game companion; reword the card someday. (5) The web app’s guide text has one stray Clue echo (“Plum, Rope and Hall”, ~line 4032 of MysteryTracker.html) — also noted in upgrade-scope.md’s legal-caution section.</w:t>
+      </w:r>
+    </w:p>
+    <w:p>
+      <w:pPr>
+        <w:pStyle w:val="ListParagraph"/>
+        <w:numPr>
+          <w:ilvl w:val="0"/>
+          <w:numId w:val="2"/>
+        </w:numPr>
+        <w:spacing w:after="100"/>
+      </w:pPr>
+      <w:r>
+        <w:rPr>
+          <w:b w:val="0"/>
+          <w:i w:val="0"/>
+        </w:rPr>
+        <w:t>For Claude — read first: Standing lesson (#70, keep it): never give click-by-click directions for a screen you cannot see — ask to view the screen first. NEXT GOAL (end of #72): START THE BUILD. The scope is complete — no open design questions remain; upgrade-scope.md holds every decision. Connect Projects → MysteryCluesTracker, read docs/upgrade-scope.md, then build ONE change at a time, each with Patrick's explicit go. A build order to discuss with Patrick (his call): tier-gate removal (auto-Σ out with it), asking auto-check removal, 🏠 column, ✓/✗ tinting, then the configurable structure (setup screen, then in-play). Patrick names the session goal; scope it together; wait for his go.</w:t>
       </w:r>
     </w:p>
     <w:p>

</xml_diff>

<commit_message>
MCTS #128 Section 31 checking pass & saved.
</commit_message>
<xml_diff>
--- a/Publishing-Strategy.docx
+++ b/Publishing-Strategy.docx
@@ -151,7 +151,7 @@
           <w:b w:val="0"/>
           <w:i w:val="0"/>
         </w:rPr>
-        <w:t>Updated 2026-07-10, session #72 (second sitting — scope + mockups). (Claude refreshes this at each session's end.)</w:t>
+        <w:t xml:space="preserve">Updated 2026-07-24, session #128. (Claude refreshes this at each session's end.)</w:t>
       </w:r>
     </w:p>
     <w:p>
@@ -168,55 +168,41 @@
           <w:b/>
           <w:i w:val="0"/>
         </w:rPr>
-        <w:t xml:space="preserve">Where we are: </w:t>
-      </w:r>
+        <w:t xml:space="preserve">Where we are: the day-to-day session chain now lives in Projects/App-Docs/master-handoff.md — read that first; it holds where things stand, the full session history, and the commit status. Since this note was last written (#72), sessions #73–#128 built the entire free mobile product: Mystery Clues Track Sheet (renamed #78) runs on Patrick's iPhone in its Xcode wrapper, portrait-locked and fully dressed (icon, emblem, home-screen name), with the game endings and accusation flow in and every modal and message settled. The master test document is COMPLETE: sections 1–31, 400 steps, machine-verified, with an index at the top, three scripted games, and Appendix D — the coverage map &amp; function list — pairing every reachable function with the steps that prove it. The phone is current; the doc side is quiet.</w:t>
+      </w:r>
+    </w:p>
+    <w:p>
+      <w:pPr>
+        <w:pStyle w:val="ListParagraph"/>
+        <w:numPr>
+          <w:ilvl w:val="0"/>
+          <w:numId w:val="2"/>
+        </w:numPr>
+        <w:spacing w:after="100"/>
+      </w:pPr>
       <w:r>
         <w:rPr>
           <w:b w:val="0"/>
           <w:i w:val="0"/>
         </w:rPr>
-        <w:t>Session #72 (2026-07-10) moved the Mystery Tracker mobile effort from decisions into work. Decisions logged in this doc: the Memory WEB version is DROPPED (elyfont.com gets a pointer only — the rich reminder scheme can’t live on the web); the ROLLOUT ORDER is decided (see “Rollout strategy”): Mystery Tracker mobile first as the rehearsal — no money expected, but full polish, it’s advertising — then Memory to the App Store, then Memory on Android after the iPhone build. Setup is COMPLETE: Xcode 26.6 + iOS 26.5 components on the MacBook Air (M5, Tahoe 26.5.2), Apple ID signed into Xcode, Developer account already held. The mechanical cleanup is ALL DONE and Patrick-verified in his browser (eight test turns): renamed to “Mystery Tracker”, voice claim gone, new icon designed and approved (three fanned cards — gold ?, green ✓, red ✗), all paths relative (new root manifest.json + service-worker.js), fonts bundled — zero external URLs, fully offline. A NO-THINKING directive for the mobile app is logged in upgrade-scope.md (Σ purely manual, premium auto-Σ comes OUT, per-turn auto-cross kept as bookkeeping, 🏠 column manual ✓/✗ only). READ upgrade-scope.md before touching the app — it holds every decision and today’s corrections.</w:t>
-      </w:r>
-    </w:p>
-    <w:p>
-      <w:pPr>
-        <w:pStyle w:val="ListParagraph"/>
-        <w:numPr>
-          <w:ilvl w:val="0"/>
-          <w:numId w:val="2"/>
-        </w:numPr>
-        <w:spacing w:after="100"/>
-      </w:pPr>
-      <w:r>
-        <w:rPr>
-          <w:b w:val="0"/>
+        <w:t xml:space="preserve">Session #129's goal: revisit THIS DOCUMENT — the strategy itself. The free product is built and its test doc is complete, so the strategy's next moves are live again: the route to the store (the listing, the name check for “Mystery Clues Track Sheet”), the rehearsal-then-Memory rollout order, and whatever the re-read of this doc surfaces as stale or ready. No app code is in scope for #129.</w:t>
+      </w:r>
+    </w:p>
+    <w:p>
+      <w:pPr>
+        <w:pStyle w:val="ListParagraph"/>
+        <w:numPr>
+          <w:ilvl w:val="0"/>
+          <w:numId w:val="2"/>
+        </w:numPr>
+        <w:spacing w:after="100"/>
+      </w:pPr>
+      <w:r>
+        <w:rPr>
+          <w:b/>
           <w:i w:val="0"/>
         </w:rPr>
-        <w:t>Also in #72 (second sitting, 2026-07-10): the upgrade SCOPE is now COMPLETE — every design question decided and recorded in upgrade-scope.md. Highlights: 🏠 cell is a blank↔✓ toggle ONLY (no ✗), placement + look mockup-approved; ALL visuals mirror the web where practical (new standing rule); configurable-structure model decided: truly variable, the player shapes it at setup (deliberate exception to mirror-the-web — the web uses a fixed 4×30 grid with muting); band colors: categories 1–3 keep red/blue/green, the 4th takes the web's cat-4 gold; setup-screen design APPROVED as mocked (Add Category button, N-of-30 counter, per-category counts); templates store the whole structure (no migration needed — no saved games exist); minimums: a category may sit empty, deck ≥ 15 cards, 2 players, 2 cards in hand, Me slot required; asks generalize to one card per non-empty category with auto-commit at the Nth pick (as the web does); the asking flow's 2-of-3 auto-check comes OUT (no-thinking); ✓/✗ tinting ports straight from the web, no mockup; LANDSCAPE DEFERRED until the existing product is finished — the upgrade ships portrait-only. Also new: CLAUDE.md + session-start.md now exist in all three project folders (App-Docs, MysteryCluesTracker, elderlyassistant) carrying the standing rules; Patrick's session opener: “#NN — name. Read CLAUDE.md, session-start.md, and the hand-off, then tell me where things stand.”</w:t>
-      </w:r>
-    </w:p>
-    <w:p>
-      <w:pPr>
-        <w:pStyle w:val="ListParagraph"/>
-        <w:numPr>
-          <w:ilvl w:val="0"/>
-          <w:numId w:val="2"/>
-        </w:numPr>
-        <w:spacing w:after="100"/>
-      </w:pPr>
-      <w:r>
-        <w:rPr>
-          <w:b/>
-          <w:i w:val="0"/>
-        </w:rPr>
-        <w:t xml:space="preserve">Loose ends: </w:t>
-      </w:r>
-      <w:r>
-        <w:rPr>
-          <w:b w:val="0"/>
-          <w:i w:val="0"/>
-        </w:rPr>
-        <w:t>(1) COMMITS OWED (Patrick, end of #72): commit BOTH repos — App-Docs and MysteryCluesTracker — and at commit DELETE the three dead files in MysteryCluesTracker: clue-manifest.json, static/clue-icon.png, static/service-worker.js (keep MysteryTracker.html there — it’s Patrick’s original hand-built Clue sheet, a keepsake). (2) Wherever the PWA is currently served, the next upload needs the NEW layout: the app file plus manifest.json, service-worker.js, and static/ (fonts + icons). (3) Still standing: the 266-step test procedure as its own tickable web checklist page (idea Patrick liked, #70). (4) The elyfont.com home card describes Mystery Tracker as a tracker for a mystery you’re READING — the app is actually a board-game companion; reword the card someday. (5) The web app’s guide text has one stray Clue echo (“Plum, Rope and Hall”, ~line 4032 of MysteryTracker.html) — also noted in upgrade-scope.md’s legal-caution section.</w:t>
+        <w:t xml:space="preserve">Loose ends: now tracked in master-handoff.md's “Loose ends” section and in each project's own pending list — re-check them during the #129 re-read. One caution: the old #72 list here included a PWA re-upload (the new file layout to wherever the PWA is served) whose standing is unrecorded — confirm it with Patrick at #129.</w:t>
       </w:r>
     </w:p>
     <w:p>

</xml_diff>

<commit_message>
Mcts #129 Publishing strategy revisit app registered
</commit_message>
<xml_diff>
--- a/Publishing-Strategy.docx
+++ b/Publishing-Strategy.docx
@@ -151,7 +151,7 @@
           <w:b w:val="0"/>
           <w:i w:val="0"/>
         </w:rPr>
-        <w:t xml:space="preserve">Updated 2026-07-24, session #128. (Claude refreshes this at each session's end.)</w:t>
+        <w:t xml:space="preserve">Updated 2026-07-24, session #129. (Claude refreshes this at each session's end.)</w:t>
       </w:r>
     </w:p>
     <w:p>
@@ -168,7 +168,7 @@
           <w:b/>
           <w:i w:val="0"/>
         </w:rPr>
-        <w:t xml:space="preserve">Where we are: the day-to-day session chain now lives in Projects/App-Docs/master-handoff.md — read that first; it holds where things stand, the full session history, and the commit status. Since this note was last written (#72), sessions #73–#128 built the entire free mobile product: Mystery Clues Track Sheet (renamed #78) runs on Patrick's iPhone in its Xcode wrapper, portrait-locked and fully dressed (icon, emblem, home-screen name), with the game endings and accusation flow in and every modal and message settled. The master test document is COMPLETE: sections 1–31, 400 steps, machine-verified, with an index at the top, three scripted games, and Appendix D — the coverage map &amp; function list — pairing every reachable function with the steps that prove it. The phone is current; the doc side is quiet.</w:t>
+        <w:t xml:space="preserve">Where we are: the day-to-day session chain now lives in Projects/App-Docs/master-handoff.md — read that first; it holds where things stand, the full session history, and the commit status. Session #129 revisited this document end to end and fixed four stale spots (the old #72 build-order block, product two's name and status, the two lanes sentence, and the rollout strategy's old phrasing), closed the old PWA re-upload loose end, and created MysteryCluesTracker/docs/ROADMAP.md, holding the ten remaining steps to the App Store. The first step is done: the App Store Connect app record for Mystery Clues Track Sheet was created, registered as “Mystery Clues Track Sheet” without the ✓, since Apple's Name field rejected that character; the in-app title is unaffected.</w:t>
       </w:r>
     </w:p>
     <w:p>
@@ -185,7 +185,7 @@
           <w:b w:val="0"/>
           <w:i w:val="0"/>
         </w:rPr>
-        <w:t xml:space="preserve">Session #129's goal: revisit THIS DOCUMENT — the strategy itself. The free product is built and its test doc is complete, so the strategy's next moves are live again: the route to the store (the listing, the name check for “Mystery Clues Track Sheet”), the rehearsal-then-Memory rollout order, and whatever the re-read of this doc surfaces as stale or ready. No app code is in scope for #129.</w:t>
+        <w:t xml:space="preserve">Session #130's goal: continue MysteryCluesTracker/docs/ROADMAP.md from step two — write and host a privacy policy at a public web address, and build a working Support URL, a real reachable page distinct from the in-app feedback button — since neither exists on elyfont.com today. No app code is expected to be in scope.</w:t>
       </w:r>
     </w:p>
     <w:p>
@@ -202,7 +202,7 @@
           <w:b/>
           <w:i w:val="0"/>
         </w:rPr>
-        <w:t xml:space="preserve">Loose ends: now tracked in master-handoff.md's “Loose ends” section and in each project's own pending list — re-check them during the #129 re-read. One caution: the old #72 list here included a PWA re-upload (the new file layout to wherever the PWA is served) whose standing is unrecorded — confirm it with Patrick at #129.</w:t>
+        <w:t xml:space="preserve">Loose ends: now tracked in master-handoff.md's “Loose ends” section and in each project's own pending list. The old #72 PWA re-upload item is now CLOSED (#129) — a real earlier PWA build exists, confirmed by Patrick to be the old phone version and no longer needed.</w:t>
       </w:r>
     </w:p>
     <w:p>
@@ -219,7 +219,7 @@
           <w:b w:val="0"/>
           <w:i w:val="0"/>
         </w:rPr>
-        <w:t>For Claude — read first: Standing lesson (#70, keep it): never give click-by-click directions for a screen you cannot see — ask to view the screen first. NEXT GOAL (end of #72): START THE BUILD. The scope is complete — no open design questions remain; upgrade-scope.md holds every decision. Connect Projects → MysteryCluesTracker, read docs/upgrade-scope.md, then build ONE change at a time, each with Patrick's explicit go. A build order to discuss with Patrick (his call): tier-gate removal (auto-Σ out with it), asking auto-check removal, 🏠 column, ✓/✗ tinting, then the configurable structure (setup screen, then in-play). Patrick names the session goal; scope it together; wait for his go.</w:t>
+        <w:t>For Claude — read first: Standing lesson (#70, keep it): never give click-by-click directions for a screen you cannot see — ask to view the screen first.</w:t>
       </w:r>
     </w:p>
     <w:p>
@@ -308,7 +308,7 @@
           <w:i w:val="false"/>
           <w:iCs w:val="false"/>
         </w:rPr>
-        <w:t xml:space="preserve">Mystery Tracker (single-file web app) and Mystery Clues Tracker (PWA). No store, no gatekeeper, no fees. I can put these in front of people freely. This is where I learn the whole publish-and-promote loop cheaply, where mistakes cost nothing.</w:t>
+        <w:t xml:space="preserve">Mystery Tracker (single-file web app) and Mystery Clues Track Sheet (Xcode/WKWebView wrapper). Mystery Tracker has no store, no gatekeeper, no fees; Mystery Clues Track Sheet goes through the App Store. I can put these in front of people freely. This is where I learn the whole publish-and-promote loop cheaply, where mistakes cost nothing.</w:t>
       </w:r>
     </w:p>
     <w:p>
@@ -390,10 +390,10 @@
           <w:b/>
           <w:bCs/>
         </w:rPr>
-        <w:t xml:space="preserve">2. Mystery Clues Tracker — mobile. </w:t>
-      </w:r>
-      <w:r>
-        <w:t xml:space="preserve">A PWA, installable on the phone. Fully done — a Beta.</w:t>
+        <w:t xml:space="preserve">2. Mystery Clues Track Sheet — mobile. </w:t>
+      </w:r>
+      <w:r>
+        <w:t xml:space="preserve">Built in a bare Xcode and WKWebView wrapper, replacing the earlier standalone PWA. The free App Store app is fully built, with its four hundred step test document complete and machine-verified; not yet submitted to the App Store.</w:t>
       </w:r>
     </w:p>
     <w:p>
@@ -462,7 +462,7 @@
           <w:i w:val="false"/>
           <w:iCs w:val="false"/>
         </w:rPr>
-        <w:t xml:space="preserve">Clean up Mystery Clues Tracker and take it to the App Store as a free app. Free + no outside-world contact keeps the prep simple — no money mechanics, minimal privacy disclosures. Route decided (#71): a bare Xcode + WKWebView wrapper — research done, details in MysteryCluesTracker/docs/upgrade-scope.md. (The other path was: convert Memory to a web version — since dropped entirely, #72.)</w:t>
+        <w:t xml:space="preserve">Clean up Mystery Clues Track Sheet and take it to the App Store as a free app. Free + no outside-world contact keeps the prep simple — no money mechanics, minimal privacy disclosures. Route decided (#71): a bare Xcode + WKWebView wrapper — research done, details in MysteryCluesTracker/docs/upgrade-scope.md. (The other path was: convert Memory to a web version — since dropped entirely, #72.)</w:t>
       </w:r>
     </w:p>
     <w:p>
@@ -484,7 +484,7 @@
           <w:i w:val="false"/>
           <w:iCs w:val="false"/>
         </w:rPr>
-        <w:t xml:space="preserve">Mystery Tracker mobile is the rehearsal, nothing more — family disinterest says there’s little to no money in it, and that’s fine; its whole job is to be the practice run for publishing Memory. The order:</w:t>
+        <w:t xml:space="preserve">Mystery Clues Track Sheet is the rehearsal, nothing more — family disinterest says there’s little to no money in it, and that’s fine; its whole job is to be the practice run for publishing Memory. The order:</w:t>
       </w:r>
     </w:p>
     <w:p>
@@ -498,7 +498,7 @@
           <w:i w:val="false"/>
           <w:iCs w:val="false"/>
         </w:rPr>
-        <w:t xml:space="preserve">(1) Mystery Tracker mobile → App Store, free — the rehearsal. No money in it, but it still gets full polish: the best app it can be, looking great — it’s advertising as much as practice. (2) Memory → App Store — the mission. (3) Memory → Android, eventually — at least after the iPhone build; timing and Google’s current fees/requirements to be researched when it matters.</w:t>
+        <w:t xml:space="preserve">(1) Mystery Clues Track Sheet → App Store, free — the rehearsal. No money in it, but it still gets full polish: the best app it can be, looking great — it’s advertising as much as practice. (2) Memory → App Store — the mission. (3) Memory → Android, eventually — at least after the iPhone build; timing and Google’s current fees/requirements to be researched when it matters.</w:t>
       </w:r>
     </w:p>
     <w:p>

</xml_diff>

<commit_message>
MCTS #135 roadmap items Description & Subtitle
</commit_message>
<xml_diff>
--- a/Publishing-Strategy.docx
+++ b/Publishing-Strategy.docx
@@ -151,7 +151,7 @@
           <w:b w:val="0"/>
           <w:i w:val="0"/>
         </w:rPr>
-        <w:t xml:space="preserve">Updated 2026-07-24, session #129. (Claude refreshes this at each session's end.)</w:t>
+        <w:t>Updated 2026-07-25, session #135. (Claude refreshes this at each session's end.)</w:t>
       </w:r>
     </w:p>
     <w:p>
@@ -185,7 +185,7 @@
           <w:b w:val="0"/>
           <w:i w:val="0"/>
         </w:rPr>
-        <w:t xml:space="preserve">Session #130's goal: continue MysteryCluesTracker/docs/ROADMAP.md from step two — write and host a privacy policy at a public web address, and build a working Support URL, a real reachable page distinct from the in-app feedback button — since neither exists on elyfont.com today. No app code is expected to be in scope.</w:t>
+        <w:t>Session #136's goal: Keywords and Promotional Text — the last two empty fields on the App Store version page, and now the only thing standing between the uploaded build and submission. Roadmap step nine is DONE as of #135: build 1.0 (1) is archived, validated clean, and uploaded to App Store Connect, sitting in the account unsubmitted and unpublished. Keywords is 100 characters and decides whether anyone ever finds the app; the standing Clue caution governs every one of them. Promotional Text is 170 characters and can be changed any time without a new build. Then step ten, submit for review.</w:t>
       </w:r>
     </w:p>
     <w:p>

</xml_diff>

<commit_message>
MCTS #136 App Store keywords and promotional text
</commit_message>
<xml_diff>
--- a/Publishing-Strategy.docx
+++ b/Publishing-Strategy.docx
@@ -151,7 +151,7 @@
           <w:b w:val="0"/>
           <w:i w:val="0"/>
         </w:rPr>
-        <w:t>Updated 2026-07-25, session #135. (Claude refreshes this at each session's end.)</w:t>
+        <w:t>Updated 2026-07-26, session #136. (Claude refreshes this at each session's end.)</w:t>
       </w:r>
     </w:p>
     <w:p>
@@ -185,7 +185,7 @@
           <w:b w:val="0"/>
           <w:i w:val="0"/>
         </w:rPr>
-        <w:t>Session #136's goal: Keywords and Promotional Text — the last two empty fields on the App Store version page, and now the only thing standing between the uploaded build and submission. Roadmap step nine is DONE as of #135: build 1.0 (1) is archived, validated clean, and uploaded to App Store Connect, sitting in the account unsubmitted and unpublished. Keywords is 100 characters and decides whether anyone ever finds the app; the standing Clue caution governs every one of them. Promotional Text is 170 characters and can be changed any time without a new build. Then step ten, submit for review.</w:t>
+        <w:t>Session #137's goal: mistouching on the grid — Patrick's own find from playing his own app. Taps land on the wrong cell, worst in the two narrowest columns, the summary (∑) column and the board (🏠) column, which sit beside cells meaning something entirely different. Nothing is diagnosed yet: the grid's sizing code has not been read. The session starts by reading how the grid lays its columns out and how wide those two actually are, measures that against what a finger needs, weighs what widening them would cost the rest of the row, and only then discusses what to change. Note the shape of it: this is the first change since the app was submitted, so it means a code change, a new version number, and a fresh submission. THE APP IS SUBMITTED as of #136 — all ten roadmap steps are done. Keywords (95 bytes) and Promotional Text (169 characters) were written and saved, six submission blockers cleared, the “You won” screenshot reshot, and version 1.0 sent to Apple on 2026-07-26: up to 48 hours to review, with release set to automatic so an approval puts it on the store by itself. Apple's answer may arrive before #137 begins and set its own agenda.</w:t>
       </w:r>
     </w:p>
     <w:p>

</xml_diff>

<commit_message>
MCTS #137 grid mistouch parked
</commit_message>
<xml_diff>
--- a/Publishing-Strategy.docx
+++ b/Publishing-Strategy.docx
@@ -151,7 +151,7 @@
           <w:b w:val="0"/>
           <w:i w:val="0"/>
         </w:rPr>
-        <w:t>Updated 2026-07-26, session #136. (Claude refreshes this at each session's end.)</w:t>
+        <w:t>Updated 2026-07-26, session #137. (Claude refreshes this at each session's end.)</w:t>
       </w:r>
     </w:p>
     <w:p>
@@ -185,7 +185,7 @@
           <w:b w:val="0"/>
           <w:i w:val="0"/>
         </w:rPr>
-        <w:t>Session #137's goal: mistouching on the grid — Patrick's own find from playing his own app. Taps land on the wrong cell, worst in the two narrowest columns, the summary (∑) column and the board (🏠) column, which sit beside cells meaning something entirely different. Nothing is diagnosed yet: the grid's sizing code has not been read. The session starts by reading how the grid lays its columns out and how wide those two actually are, measures that against what a finger needs, weighs what widening them would cost the rest of the row, and only then discusses what to change. Note the shape of it: this is the first change since the app was submitted, so it means a code change, a new version number, and a fresh submission. THE APP IS SUBMITTED as of #136 — all ten roadmap steps are done. Keywords (95 bytes) and Promotional Text (169 characters) were written and saved, six submission blockers cleared, the “You won” screenshot reshot, and version 1.0 sent to Apple on 2026-07-26: up to 48 hours to review, with release set to automatic so an approval puts it on the store by itself. Apple's answer may arrive before #137 begins and set its own agenda.</w:t>
+        <w:t>Session #138’s goal: the test-doc catch-up to the code — pending item 4, open since #132 and grown at #133. The spec is a step behind the phone. Three things need it: the #132 shower line, the #133 undo and accusation Log wordings, and every step still describing the OLD accusation flow, since the auto-opening modal and the undoable endings are gone from the code, which means those sections and the matching Appendix D entries need the rewrite. It all goes through docs/build-mcts-test.js — the docx is generated and never hand-edited, then verified row-for-row. How big it is is NOT KNOWN YET: counting which of the 400 steps still describe the old flow is the first piece of work, not a preliminary to it. THE APP IS STILL WITH APPLE — submitted 2026-07-26 with all ten roadmap steps done, up to 48 hours to review, release set to automatic so an approval puts it on the store by itself; no answer had arrived by the end of #137. Two things may take the agenda first. Apple’s answer may arrive and set its own. And the mistouching is waiting on Patrick’s own test: #137 diagnosed it from the code and built nothing — the grid row is exactly full at 430 pixels, so width is zero-sum; six player columns are always built however many are playing; the ∑ and 🏠 cells are 24 × 28 against Apple’s 44 × 44 minimum; nothing absorbs a near miss and nothing shows where the finger landed; 🏠 alone acts on first touch; and a slip one row off in the active column says nothing and quietly becomes part of the claim. Patrick’s own insight — that the trouble starts before his finger touches the glass — is answered by the phone itself: Settings → Accessibility → Touch → Touch Accommodations, verified on Apple’s own page. His decision is to try those settings before any code change, since a code change now means a new version number and a fresh submission.</w:t>
       </w:r>
     </w:p>
     <w:p>

</xml_diff>

<commit_message>
MCTS 139 Rebuild Test Spec Section 31 End of Game & 25.18-20
</commit_message>
<xml_diff>
--- a/Publishing-Strategy.docx
+++ b/Publishing-Strategy.docx
@@ -151,7 +151,7 @@
           <w:b w:val="0"/>
           <w:i w:val="0"/>
         </w:rPr>
-        <w:t>Updated 2026-07-26, session #137. (Claude refreshes this at each session's end.)</w:t>
+        <w:t xml:space="preserve">Updated 2026-07-27, session #139. (Claude refreshes this at each session's end.)</w:t>
       </w:r>
     </w:p>
     <w:p>
@@ -185,7 +185,7 @@
           <w:b w:val="0"/>
           <w:i w:val="0"/>
         </w:rPr>
-        <w:t>Session #138’s goal: the test-doc catch-up to the code — pending item 4, open since #132 and grown at #133. The spec is a step behind the phone. Three things need it: the #132 shower line, the #133 undo and accusation Log wordings, and every step still describing the OLD accusation flow, since the auto-opening modal and the undoable endings are gone from the code, which means those sections and the matching Appendix D entries need the rewrite. It all goes through docs/build-mcts-test.js — the docx is generated and never hand-edited, then verified row-for-row. How big it is is NOT KNOWN YET: counting which of the 400 steps still describe the old flow is the first piece of work, not a preliminary to it. THE APP IS STILL WITH APPLE — submitted 2026-07-26 with all ten roadmap steps done, up to 48 hours to review, release set to automatic so an approval puts it on the store by itself; no answer had arrived by the end of #137. Two things may take the agenda first. Apple’s answer may arrive and set its own. And the mistouching is waiting on Patrick’s own test: #137 diagnosed it from the code and built nothing — the grid row is exactly full at 430 pixels, so width is zero-sum; six player columns are always built however many are playing; the ∑ and 🏠 cells are 24 × 28 against Apple’s 44 × 44 minimum; nothing absorbs a near miss and nothing shows where the finger landed; 🏠 alone acts on first touch; and a slip one row off in the active column says nothing and quietly becomes part of the claim. Patrick’s own insight — that the trouble starts before his finger touches the glass — is answered by the phone itself: Settings → Accessibility → Touch → Touch Accommodations, verified on Apple’s own page. His decision is to try those settings before any code change, since a code change now means a new version number and a fresh submission.</w:t>
+        <w:t xml:space="preserve">Session #140’s goal: the §31 rewrite — the last of pending item 4. All seventeen steps of “31 — End of Game” describe the accusation flow #133 removed, so the section gets written fresh rather than patched (Patrick’s call, #138). Its first two steps are dropped rather than moved: §18.5 already tests the more-than-one-⭐ warning, and Patrick ruled at #139 that the watcher tests belong there. Read MysteryCluesTracker/docs/build-history.md “#139” first — the whole ⭐ Accuse flow is written out there from the code (the one door, the modal’s three parts and their headings, both dim-tap refusals, the four ending lines and which one glows, the Log line’s format, the frozen-tap message), so the code need not be read again. One question has to be answered before any drafting: which ending §31 finishes on. Three of the four endings are terminal and no verdict can be undone — only an opponent’s wrong accusation leaves the game alive — so the section reaches exactly one ending and the document stops there for good. It all goes through docs/build-mcts-test.js; the docx is generated and never hand-edited, then verified row-for-row. What #139 finished: #138 was reconstructed from the code and written up (its turn-bar bug, found by Patrick and fixed in two lines, had left no record at all), and §25 was rebuilt to 20 steps so the doc now proves that fix — the docx stands at 401 steps, machine-verified, and the phone is current. THE APP IS STILL WITH APPLE — submitted 2026-07-26 with all ten roadmap steps done, up to 48 hours to review, release set to automatic so an approval puts it on the store by itself; no answer had arrived by the end of #139. Note that the build with Apple predates the #138 fix. Two things may take the agenda first. Apple’s answer may arrive and set its own. And the mistouching is still waiting on Patrick’s own test: #137 diagnosed it from the code and built nothing, and his decision is to try Settings → Accessibility → Touch → Touch Accommodations before any code change, since a code change now means a new version number and a fresh submission.</w:t>
       </w:r>
     </w:p>
     <w:p>

</xml_diff>

<commit_message>
MCTS # 140 Miss-touch revisited. Widen the Summary & House colums Resubmit Build 2 to App Store completed.
</commit_message>
<xml_diff>
--- a/Publishing-Strategy.docx
+++ b/Publishing-Strategy.docx
@@ -151,7 +151,7 @@
           <w:b w:val="0"/>
           <w:i w:val="0"/>
         </w:rPr>
-        <w:t xml:space="preserve">Updated 2026-07-27, session #139. (Claude refreshes this at each session's end.)</w:t>
+        <w:t>Updated 2026-07-27, session #140. (Claude refreshes this at each session's end.)</w:t>
       </w:r>
     </w:p>
     <w:p>
@@ -185,7 +185,7 @@
           <w:b w:val="0"/>
           <w:i w:val="0"/>
         </w:rPr>
-        <w:t xml:space="preserve">Session #140’s goal: the §31 rewrite — the last of pending item 4. All seventeen steps of “31 — End of Game” describe the accusation flow #133 removed, so the section gets written fresh rather than patched (Patrick’s call, #138). Its first two steps are dropped rather than moved: §18.5 already tests the more-than-one-⭐ warning, and Patrick ruled at #139 that the watcher tests belong there. Read MysteryCluesTracker/docs/build-history.md “#139” first — the whole ⭐ Accuse flow is written out there from the code (the one door, the modal’s three parts and their headings, both dim-tap refusals, the four ending lines and which one glows, the Log line’s format, the frozen-tap message), so the code need not be read again. One question has to be answered before any drafting: which ending §31 finishes on. Three of the four endings are terminal and no verdict can be undone — only an opponent’s wrong accusation leaves the game alive — so the section reaches exactly one ending and the document stops there for good. It all goes through docs/build-mcts-test.js; the docx is generated and never hand-edited, then verified row-for-row. What #139 finished: #138 was reconstructed from the code and written up (its turn-bar bug, found by Patrick and fixed in two lines, had left no record at all), and §25 was rebuilt to 20 steps so the doc now proves that fix — the docx stands at 401 steps, machine-verified, and the phone is current. THE APP IS STILL WITH APPLE — submitted 2026-07-26 with all ten roadmap steps done, up to 48 hours to review, release set to automatic so an approval puts it on the store by itself; no answer had arrived by the end of #139. Note that the build with Apple predates the #138 fix. Two things may take the agenda first. Apple’s answer may arrive and set its own. And the mistouching is still waiting on Patrick’s own test: #137 diagnosed it from the code and built nothing, and his decision is to try Settings → Accessibility → Touch → Touch Accommodations before any code change, since a code change now means a new version number and a fresh submission.</w:t>
+        <w:t>Session #141’s goal: the test-spec updates — §19 and §31, all of pending item 4. §19 “Cell Notes” fell behind at #140 when the cell-note modal was rebuilt: ten of its eleven steps describe a Set button that no longer exists and a six-character limit that is now four. §31 “End of Game” is a whole rewrite — all seventeen steps describe the accusation flow #133 removed — and its first question, which shapes the rest, is which of the four endings it finishes on, since three are terminal. Read MysteryCluesTracker/docs/build-history.md “#140” for §19’s exact breakages and “#139” for the whole accusation flow, harvested from the code so it need not be read again. Note also: at #140 the app was pulled back out of review and resubmitted as build 1.0 (2) carrying the grid, cell-note and Guide changes, and the release setting is now MANUAL — an approval will wait for Patrick rather than shipping itself.</w:t>
       </w:r>
     </w:p>
     <w:p>

</xml_diff>

<commit_message>
MCTS #141 — the test-spec updates §31 built & test
</commit_message>
<xml_diff>
--- a/Publishing-Strategy.docx
+++ b/Publishing-Strategy.docx
@@ -151,7 +151,7 @@
           <w:b w:val="0"/>
           <w:i w:val="0"/>
         </w:rPr>
-        <w:t>Updated 2026-07-27, session #140. (Claude refreshes this at each session's end.)</w:t>
+        <w:t>Updated 2026-07-27, session #141. (Claude refreshes this at each session's end.)</w:t>
       </w:r>
     </w:p>
     <w:p>
@@ -185,7 +185,7 @@
           <w:b w:val="0"/>
           <w:i w:val="0"/>
         </w:rPr>
-        <w:t>Session #141’s goal: the test-spec updates — §19 and §31, all of pending item 4. §19 “Cell Notes” fell behind at #140 when the cell-note modal was rebuilt: ten of its eleven steps describe a Set button that no longer exists and a six-character limit that is now four. §31 “End of Game” is a whole rewrite — all seventeen steps describe the accusation flow #133 removed — and its first question, which shapes the rest, is which of the four endings it finishes on, since three are terminal. Read MysteryCluesTracker/docs/build-history.md “#140” for §19’s exact breakages and “#139” for the whole accusation flow, harvested from the code so it need not be read again. Note also: at #140 the app was pulled back out of review and resubmitted as build 1.0 (2) carrying the grid, cell-note and Guide changes, and the release setting is now MANUAL — an approval will wait for Patrick rather than shipping itself.</w:t>
+        <w:t>Session #142’s goal: §19 “Cell Notes” — the last piece of pending item 4. The cell-note modal was rebuilt at #140 and ten of §19’s eleven steps describe what is gone: a Set button beside the box and a six-character limit. What the modal does now: four characters, no Set button, Done saves and then closes, Clear still empties it. The exact code lines are in MysteryCluesTracker/docs/build-history.md “#140” — read those, not the code. §31 “End of Game” is DONE (#141): rewritten to eighteen steps on Patrick’s design, phone-run by him, and built into the script and the docx, which now stands at 402 steps. Two things may take the agenda first: Apple’s answer on build 1.0 (2) may arrive (the release is MANUAL, so an approval waits for Patrick), and the mistouching remainder is PARKED at Patrick’s direction (#141) — not to be raised until he calls for it.</w:t>
       </w:r>
     </w:p>
     <w:p>

</xml_diff>

<commit_message>
MCTS #142 Section 19 cell notes Spec update
</commit_message>
<xml_diff>
--- a/Publishing-Strategy.docx
+++ b/Publishing-Strategy.docx
@@ -151,7 +151,7 @@
           <w:b w:val="0"/>
           <w:i w:val="0"/>
         </w:rPr>
-        <w:t>Updated 2026-07-27, session #141. (Claude refreshes this at each session's end.)</w:t>
+        <w:t>Updated 2026-07-27, session #142. (Claude refreshes this at each session's end.)</w:t>
       </w:r>
     </w:p>
     <w:p>
@@ -185,7 +185,7 @@
           <w:b w:val="0"/>
           <w:i w:val="0"/>
         </w:rPr>
-        <w:t>Session #142’s goal: §19 “Cell Notes” — the last piece of pending item 4. The cell-note modal was rebuilt at #140 and ten of §19’s eleven steps describe what is gone: a Set button beside the box and a six-character limit. What the modal does now: four characters, no Set button, Done saves and then closes, Clear still empties it. The exact code lines are in MysteryCluesTracker/docs/build-history.md “#140” — read those, not the code. §31 “End of Game” is DONE (#141): rewritten to eighteen steps on Patrick’s design, phone-run by him, and built into the script and the docx, which now stands at 402 steps. Two things may take the agenda first: Apple’s answer on build 1.0 (2) may arrive (the release is MANUAL, so an approval waits for Patrick), and the mistouching remainder is PARKED at Patrick’s direction (#141) — not to be raised until he calls for it.</w:t>
+        <w:t>Session #143’s goal: the wordings sweep — the last piece of pending item 4, and the only piece still owed. Every section of the mobile test document now matches the code: §31 “End of Game” was rewritten at #141 and §19 “Cell Notes” at #142, and the document stands at 401 steps, machine-verified. What has never been checked is whether the wordings changed at #132 and #133 are current wherever else they appear in those 401 steps — the Log shower line (“You” when it is you showing, the card named when you know it), the four accusation verdicts, and Appendix D’s matching entries. Detail in MysteryCluesTracker/docs/build-history.md “#142” and in Projects/App-Docs/master-handoff.md. Two things may take the agenda first: Apple’s answer on build 1.0 (2) may arrive (the release is MANUAL, so an approval waits for Patrick), and the mistouching remainder is PARKED at Patrick’s direction (#141) — not to be raised until he calls for it.</w:t>
       </w:r>
     </w:p>
     <w:p>

</xml_diff>

<commit_message>
MCTSB 143 — the wordings sweep researched & saved
</commit_message>
<xml_diff>
--- a/Publishing-Strategy.docx
+++ b/Publishing-Strategy.docx
@@ -151,7 +151,7 @@
           <w:b w:val="0"/>
           <w:i w:val="0"/>
         </w:rPr>
-        <w:t>Updated 2026-07-27, session #142. (Claude refreshes this at each session's end.)</w:t>
+        <w:t>Updated 2026-07-27, session #143. (Claude refreshes this at each session's end.)</w:t>
       </w:r>
     </w:p>
     <w:p>
@@ -185,7 +185,7 @@
           <w:b w:val="0"/>
           <w:i w:val="0"/>
         </w:rPr>
-        <w:t>Session #143’s goal: the wordings sweep — the last piece of pending item 4, and the only piece still owed. Every section of the mobile test document now matches the code: §31 “End of Game” was rewritten at #141 and §19 “Cell Notes” at #142, and the document stands at 401 steps, machine-verified. What has never been checked is whether the wordings changed at #132 and #133 are current wherever else they appear in those 401 steps — the Log shower line (“You” when it is you showing, the card named when you know it), the four accusation verdicts, and Appendix D’s matching entries. Detail in MysteryCluesTracker/docs/build-history.md “#142” and in Projects/App-Docs/master-handoff.md. Two things may take the agenda first: Apple’s answer on build 1.0 (2) may arrive (the release is MANUAL, so an approval waits for Patrick), and the mistouching remainder is PARKED at Patrick’s direction (#141) — not to be raised until he calls for it.</w:t>
+        <w:t>Session #144’s goal, set by Patrick at the end of #143: BUILD THE UPDATES #143 DOCUMENTED — everything the sweep found that the test spec needs, implemented. No fresh investigation is owed; the finding work is done and the code has been read. Two pieces. First, §22 “Player Out”: six steps still walk the pre-#133 Out modal, which has had one door since #133, and the design question to settle before any step is written is how Ann goes out now — her wrong-accusation mark rides forward into §23’s and §25’s start banners, so it cannot simply be deleted. Same shape of work as §19 (#142) and §31 (#141): Patrick’s rulings, a phone run, then the build. Second, Appendix D: remove the three functions that no longer exist, bring five descriptions current, renumber the coverage map’s six references to the old §31, refresh the drifted line numbers, and finish the clearCellNote entry. Two small wording items came out of the sweep as well — 21.5 is incomplete, and the #132 You-form and named card are proven nowhere in the 401 steps. It all goes through docs/build-mcts-test.js; the docx is generated, never hand-edited, then verified row-for-row. #143 built nothing, touched no app code, and left the document at 401 steps. Detail in MysteryCluesTracker/docs/build-history.md “#143” and in Projects/App-Docs/master-handoff.md. Two things may take the agenda first: Apple’s answer on build 1.0 (2) may arrive (the release is MANUAL, so an approval waits for Patrick), and the mistouching remainder is PARKED at Patrick’s direction (#141) — not to be raised until he calls for it.</w:t>
       </w:r>
     </w:p>
     <w:p>

</xml_diff>

<commit_message>
MCTS 144 Wordings sweep and status changes started..
</commit_message>
<xml_diff>
--- a/Publishing-Strategy.docx
+++ b/Publishing-Strategy.docx
@@ -151,7 +151,7 @@
           <w:b w:val="0"/>
           <w:i w:val="0"/>
         </w:rPr>
-        <w:t>Updated 2026-07-27, session #143. (Claude refreshes this at each session's end.)</w:t>
+        <w:t>Updated 2026-07-27, session #144. (Claude refreshes this at each session's end.)</w:t>
       </w:r>
     </w:p>
     <w:p>
@@ -185,7 +185,7 @@
           <w:b w:val="0"/>
           <w:i w:val="0"/>
         </w:rPr>
-        <w:t>Session #144’s goal, set by Patrick at the end of #143: BUILD THE UPDATES #143 DOCUMENTED — everything the sweep found that the test spec needs, implemented. No fresh investigation is owed; the finding work is done and the code has been read. Two pieces. First, §22 “Player Out”: six steps still walk the pre-#133 Out modal, which has had one door since #133, and the design question to settle before any step is written is how Ann goes out now — her wrong-accusation mark rides forward into §23’s and §25’s start banners, so it cannot simply be deleted. Same shape of work as §19 (#142) and §31 (#141): Patrick’s rulings, a phone run, then the build. Second, Appendix D: remove the three functions that no longer exist, bring five descriptions current, renumber the coverage map’s six references to the old §31, refresh the drifted line numbers, and finish the clearCellNote entry. Two small wording items came out of the sweep as well — 21.5 is incomplete, and the #132 You-form and named card are proven nowhere in the 401 steps. It all goes through docs/build-mcts-test.js; the docx is generated, never hand-edited, then verified row-for-row. #143 built nothing, touched no app code, and left the document at 401 steps. Detail in MysteryCluesTracker/docs/build-history.md “#143” and in Projects/App-Docs/master-handoff.md. Two things may take the agenda first: Apple’s answer on build 1.0 (2) may arrive (the release is MANUAL, so an approval waits for Patrick), and the mistouching remainder is PARKED at Patrick’s direction (#141) — not to be raised until he calls for it.</w:t>
+        <w:t>Session #145’s goal, set at the end of #144: FINISH THE TEST-DOC CATCH-UP. Two pieces are left and both are build work; the finding is done and the code has been read. First, §22’s Log step, now 22.28: it reads “Turn 9 — 😢 Ann: Wrong Accusation”, which the app can no longer write, since logOut is called from one place and always passes ‘quit’. Ann’s exit now writes an accusation entry instead. The same step still says the Undo entry has two detail lines when it draws one, and calls both entries “out entries” when only one is. Second, Appendix D, untouched: remove the three functions that no longer exist, bring five descriptions current, renumber the coverage map’s references to the old §31 and to §22’s old numbers, refresh the drifted line numbers, and finish the clearCellNote entry. One note, not a job: the #132 You-form and the named card are still proven nowhere in the document. It all goes through docs/build-mcts-test.js; the docx is generated, never hand-edited, then verified row-for-row. #144 built 21.4 and rebuilt §22 from 25 steps to 29, leaving the document at 405 steps and touching no app code. Detail in MysteryCluesTracker/docs/build-history.md “#144” and in Projects/App-Docs/master-handoff.md. Two things may take the agenda first: Apple’s answer on build 1.0 (2) may arrive (the release is MANUAL, so an approval waits for Patrick), and the mistouching remainder is PARKED at Patrick’s direction (#141) — not to be raised until he calls for it.</w:t>
       </w:r>
     </w:p>
     <w:p>

</xml_diff>

<commit_message>
46-new. Read docs/handoff.md. The goal:The road to releasing Memory. Do not edit until I give a separate go.
</commit_message>
<xml_diff>
--- a/Publishing-Strategy.docx
+++ b/Publishing-Strategy.docx
@@ -151,7 +151,7 @@
           <w:b w:val="0"/>
           <w:i w:val="0"/>
         </w:rPr>
-        <w:t>Updated 2026-07-27, session #144. (Claude refreshes this at each session's end.)</w:t>
+        <w:t>Updated 2026-08-31, Memory #46-new. (Claude refreshes this at each session's end.)</w:t>
       </w:r>
     </w:p>
     <w:p>
@@ -168,7 +168,7 @@
           <w:b/>
           <w:i w:val="0"/>
         </w:rPr>
-        <w:t xml:space="preserve">Where we are: the day-to-day session chain now lives in Projects/App-Docs/master-handoff.md — read that first; it holds where things stand, the full session history, and the commit status. Session #129 revisited this document end to end and fixed four stale spots (the old #72 build-order block, product two's name and status, the two lanes sentence, and the rollout strategy's old phrasing), closed the old PWA re-upload loose end, and created MysteryCluesTracker/docs/ROADMAP.md, holding the ten remaining steps to the App Store. The first step is done: the App Store Connect app record for Mystery Clues Track Sheet was created, registered as “Mystery Clues Track Sheet” without the ✓, since Apple's Name field rejected that character; the in-app title is unaffected.</w:t>
+        <w:t>Where we are: Mystery Clues Track Sheet is live on the App Store since 2026-08-06. The rehearsal is done. Memory is the mission. He is living with the #45-new build. The remaining app work and the first store submit run in tandem: submit without auto-release, and keep working while Apple reviews. The first trip is the slow one; later ready versions go through easier. That was learned from Mystery. Day-to-day status for each project still lives in Projects/App-Docs/master-handoff.md.</w:t>
       </w:r>
     </w:p>
     <w:p>
@@ -185,7 +185,7 @@
           <w:b w:val="0"/>
           <w:i w:val="0"/>
         </w:rPr>
-        <w:t>Session #145’s goal, set at the end of #144: FINISH THE TEST-DOC CATCH-UP. Two pieces are left and both are build work; the finding is done and the code has been read. First, §22’s Log step, now 22.28: it reads “Turn 9 — 😢 Ann: Wrong Accusation”, which the app can no longer write, since logOut is called from one place and always passes ‘quit’. Ann’s exit now writes an accusation entry instead. The same step still says the Undo entry has two detail lines when it draws one, and calls both entries “out entries” when only one is. Second, Appendix D, untouched: remove the three functions that no longer exist, bring five descriptions current, renumber the coverage map’s references to the old §31 and to §22’s old numbers, refresh the drifted line numbers, and finish the clearCellNote entry. One note, not a job: the #132 You-form and the named card are still proven nowhere in the document. It all goes through docs/build-mcts-test.js; the docx is generated, never hand-edited, then verified row-for-row. #144 built 21.4 and rebuilt §22 from 25 steps to 29, leaving the document at 405 steps and touching no app code. Detail in MysteryCluesTracker/docs/build-history.md “#144” and in Projects/App-Docs/master-handoff.md. Two things may take the agenda first: Apple’s answer on build 1.0 (2) may arrive (the release is MANUAL, so an approval waits for Patrick), and the mistouching remainder is PARKED at Patrick’s direction (#141) — not to be raised until he calls for it.</w:t>
+        <w:t>The selling description is its own work, over as many sessions as it takes: easy to read and follow, well worded, warm and interesting. Apple’s product-page craft and Ogilvy’s English, pointed at the best parts of Memory — not a spec sheet. Daily is the foundation the rest was built around. Daily is ordinary timed reminders (10:00, take your medication), and the standing list with no clock (did I take my vitamins? have I texted my family?) where you tell it you did it and when, and whatever from the other pages lands today. The day you live in is the center. Everything else is how often a thing comes back, or a one-time, or someday, shown on Daily when it belongs today. TickTick is the comparable; he used it and was left wanting a daily that did not need a clock. Claude writes the sell (the voice already taught on the test procedures and the Mystery Guide). Memory’s docs index has no file for this; at his word it is recorded here.</w:t>
       </w:r>
     </w:p>
     <w:p>
@@ -202,7 +202,7 @@
           <w:b/>
           <w:i w:val="0"/>
         </w:rPr>
-        <w:t xml:space="preserve">Loose ends: now tracked in master-handoff.md's “Loose ends” section and in each project's own pending list. The old #72 PWA re-upload item is now CLOSED (#129) — a real earlier PWA build exists, confirmed by Patrick to be the old phone version and no longer needed.</w:t>
+        <w:t>Money is still being discovered. The first submit does not have to declare the app as paid. Apple asks for a price, and Free is a real price. Price can change later. People who already downloaded a free app keep it. Extras inside the app can be added in a later version. To charge, the Paid Apps Agreement and tax and banking must be active; signing that does not make Memory paid. TickTick is free plus about $36 a year. Loose ends stay in master-handoff.md and each project’s pending list.</w:t>
       </w:r>
     </w:p>
     <w:p>
@@ -390,31 +390,27 @@
           <w:b/>
           <w:bCs/>
         </w:rPr>
-        <w:t xml:space="preserve">2. Mystery Clues Track Sheet — mobile. </w:t>
-      </w:r>
-      <w:r>
-        <w:t xml:space="preserve">Built in a bare Xcode and WKWebView wrapper, replacing the earlier standalone PWA. The free App Store app is fully built, with its four hundred step test document complete and machine-verified; not yet submitted to the App Store.</w:t>
-      </w:r>
-    </w:p>
-    <w:p>
-      <w:pPr>
-        <w:pStyle w:val="ListParagraph"/>
-        <w:numPr>
-          <w:ilvl w:val="0"/>
-          <w:numId w:val="2"/>
-        </w:numPr>
-        <w:spacing w:after="100"/>
-      </w:pPr>
-      <w:r>
-        <w:rPr>
-          <w:b/>
-          <w:bCs/>
-        </w:rPr>
-        <w:t xml:space="preserve">3. A Place To Remember (Memory) — native iPhone app. </w:t>
-      </w:r>
-      <w:r>
-        <w:t xml:space="preserve">Mostly built — an Alpha.</w:t>
-      </w:r>
+        <w:t>2. Mystery Clues Track Sheet — mobile. Live on the App Store since 2026-08-06, free. The rehearsal is done.</w:t>
+      </w:r>
+      <w:r/>
+    </w:p>
+    <w:p>
+      <w:pPr>
+        <w:pStyle w:val="ListParagraph"/>
+        <w:numPr>
+          <w:ilvl w:val="0"/>
+          <w:numId w:val="2"/>
+        </w:numPr>
+        <w:spacing w:after="100"/>
+      </w:pPr>
+      <w:r>
+        <w:rPr>
+          <w:b/>
+          <w:bCs/>
+        </w:rPr>
+        <w:t>3. A Place To Remember (Memory) — native iPhone app. Alpha, on his phone. He is living with the #45-new build. A first-class selling description was begun at #46-new. The first store submit is without auto-release, in tandem with the remaining work.</w:t>
+      </w:r>
+      <w:r/>
     </w:p>
     <w:p>
       <w:pPr>
@@ -498,7 +494,7 @@
           <w:i w:val="false"/>
           <w:iCs w:val="false"/>
         </w:rPr>
-        <w:t xml:space="preserve">(1) Mystery Clues Track Sheet → App Store, free — the rehearsal. No money in it, but it still gets full polish: the best app it can be, looking great — it’s advertising as much as practice. (2) Memory → App Store — the mission. (3) Memory → Android, eventually — at least after the iPhone build; timing and Google’s current fees/requirements to be researched when it matters.</w:t>
+        <w:t>(1) Mystery Clues Track Sheet → App Store, free — the rehearsal. Done: live since 2026-08-06. (2) Memory → App Store — the mission. Underway at #46-new: submit without auto-release, remaining work in tandem, selling description in progress, money model still open. (3) Memory → Android, eventually — at least after the iPhone build; timing and Google’s current fees/requirements to be researched when it matters.</w:t>
       </w:r>
     </w:p>
     <w:p>
@@ -639,7 +635,7 @@
           <w:i w:val="false"/>
           <w:iCs w:val="false"/>
         </w:rPr>
-        <w:t xml:space="preserve">Phase 2 — Prep Remember When for the store. </w:t>
+        <w:t>Phase 2 — Prep Memory for the store. Apply the lessons: the App Store listing, the legal pieces, screenshots, and the one money decision — free, paid, or free-with-extras. The selling description has begun (#46-new). The money decision is still open. The developer account is already in use from Mystery Clues.</w:t>
       </w:r>
       <w:r>
         <w:rPr>
@@ -648,7 +644,6 @@
           <w:i w:val="false"/>
           <w:iCs w:val="false"/>
         </w:rPr>
-        <w:t xml:space="preserve">Apply the lessons: developer account, the App Store listing, the legal pieces, screenshots, and the one money decision — free, paid, or free-with-extras.</w:t>
       </w:r>
     </w:p>
     <w:p>
@@ -662,7 +657,7 @@
           <w:i w:val="false"/>
           <w:iCs w:val="false"/>
         </w:rPr>
-        <w:t xml:space="preserve">Phase 3 — Submit, launch, settle into the upkeep rhythm.</w:t>
+        <w:t>Phase 3 — Submit, launch, settle into the upkeep rhythm. The first submit does not wait until everything is finished: it runs in tandem with remaining work, without auto-release, so Apple’s first review can happen while the rest is still being done.</w:t>
       </w:r>
     </w:p>
     <w:p>
@@ -1087,7 +1082,7 @@
           </w:tcPr>
           <w:p>
             <w:r>
-              <w:t xml:space="preserve">Not started</w:t>
+              <w:t>In progress</w:t>
             </w:r>
           </w:p>
         </w:tc>
@@ -1109,7 +1104,7 @@
           </w:tcPr>
           <w:p>
             <w:r>
-              <w:t xml:space="preserve"/>
+              <w:t>2026-08-31, #46-new: first submit need not declare profit; Free is a real price; can change later. Paid Apps Agreement and tax/banking are what allow charging, and do not themselves make Memory paid. TickTick (free + about $36/year) is the comparable. Model still open.</w:t>
             </w:r>
           </w:p>
         </w:tc>
@@ -1168,7 +1163,7 @@
           </w:tcPr>
           <w:p>
             <w:r>
-              <w:t xml:space="preserve">Not started</w:t>
+              <w:t>In progress</w:t>
             </w:r>
           </w:p>
         </w:tc>
@@ -1190,7 +1185,7 @@
           </w:tcPr>
           <w:p>
             <w:r>
-              <w:t xml:space="preserve"/>
+              <w:t>2026-08-31, #46-new: a first-class selling description is its own work, recorded in this file. Daily is the foundation. Not a spec sheet. Claude for the writing.</w:t>
             </w:r>
           </w:p>
         </w:tc>

</xml_diff>

<commit_message>
47-new. Read docs/handoff.md. The goal:Continue the road to releasing Memory.
</commit_message>
<xml_diff>
--- a/Publishing-Strategy.docx
+++ b/Publishing-Strategy.docx
@@ -151,7 +151,7 @@
           <w:b w:val="0"/>
           <w:i w:val="0"/>
         </w:rPr>
-        <w:t>Updated 2026-08-31, Memory #46-new. (Claude refreshes this at each session's end.)</w:t>
+        <w:t>Updated 2026-08-31, Memory #47-new. (Claude refreshes this at each session's end.)</w:t>
       </w:r>
     </w:p>
     <w:p>
@@ -185,7 +185,7 @@
           <w:b w:val="0"/>
           <w:i w:val="0"/>
         </w:rPr>
-        <w:t>The selling description is its own work, over as many sessions as it takes: easy to read and follow, well worded, warm and interesting. Apple’s product-page craft and Ogilvy’s English, pointed at the best parts of Memory — not a spec sheet. Daily is the foundation the rest was built around. Daily is ordinary timed reminders (10:00, take your medication), and the standing list with no clock (did I take my vitamins? have I texted my family?) where you tell it you did it and when, and whatever from the other pages lands today. The day you live in is the center. Everything else is how often a thing comes back, or a one-time, or someday, shown on Daily when it belongs today. TickTick is the comparable; he used it and was left wanting a daily that did not need a clock. Claude writes the sell (the voice already taught on the test procedures and the Mystery Guide). Memory’s docs index has no file for this; at his word it is recorded here.</w:t>
+        <w:t>The selling description is its own work, over as many sessions as it takes: easy to read and follow, well worded, warm and interesting. Apple’s product-page craft and Ogilvy’s English, pointed at the best parts of Memory — not a spec sheet. Daily is the foundation the rest was built around. Daily is ordinary timed reminders (10:00, take your medication), and the standing list with no clock (did I take my vitamins? have I texted my family?) where you tell it you did it and when, and whatever from the other pages lands today. The day you live in is the center. Everything else is how often a thing comes back, or a one-time, or someday, shown on Daily when it belongs today. TickTick is the comparable; he used it and was left wanting a daily that did not need a clock. Claude writes the sell (the voice already taught on the test procedures and the Mystery Guide). The inventory is docs/Memory features.docx in the Memory repo. Comparables at #47-new: looked from the features file, not tiny elderly apps. This sits with repeating reminders and personal tasks. Apple Reminders is the free default. TickTick, Todoist, Things, and Due are the paid layer that exists because that default is not enough. He opened Reminders: this one does more, easier.</w:t>
       </w:r>
     </w:p>
     <w:p>
@@ -408,7 +408,7 @@
           <w:b/>
           <w:bCs/>
         </w:rPr>
-        <w:t>3. A Place To Remember (Memory) — native iPhone app. Alpha, on his phone. He is living with the #45-new build. A first-class selling description was begun at #46-new. The first store submit is without auto-release, in tandem with the remaining work.</w:t>
+        <w:t>3. A Place To Remember (Memory) — native iPhone app. Alpha, on his phone. He is living with the #45-new build. A selling description was begun at #46-new and is a good start, left at #47-new. The first store submit is without auto-release, in tandem with the remaining work.</w:t>
       </w:r>
       <w:r/>
     </w:p>
@@ -494,7 +494,7 @@
           <w:i w:val="false"/>
           <w:iCs w:val="false"/>
         </w:rPr>
-        <w:t>(1) Mystery Clues Track Sheet → App Store, free — the rehearsal. Done: live since 2026-08-06. (2) Memory → App Store — the mission. Underway at #46-new: submit without auto-release, remaining work in tandem, selling description in progress, money model still open. (3) Memory → Android, eventually — at least after the iPhone build; timing and Google’s current fees/requirements to be researched when it matters.</w:t>
+        <w:t>(1) Mystery Clues Track Sheet → App Store, free — the rehearsal. Done: live since 2026-08-06. (2) Memory → App Store — the mission. Underway: submit without auto-release, remaining work in tandem, selling description a good start and left, money model still open. (3) Memory → Android, eventually — at least after the iPhone build; timing and Google’s current fees/requirements to be researched when it matters.</w:t>
       </w:r>
     </w:p>
     <w:p>
@@ -1185,7 +1185,7 @@
           </w:tcPr>
           <w:p>
             <w:r>
-              <w:t>2026-08-31, #46-new: a first-class selling description is its own work, recorded in this file. Daily is the foundation. Not a spec sheet. Claude for the writing.</w:t>
+              <w:t>2026-08-31, #47-new: selling description a good start and left. Comparables from the features file, not elderly apps: repeating reminders and personal tasks. Apple Reminders is the free default; TickTick, Todoist, Things, and Due exist because it is not enough.</w:t>
             </w:r>
           </w:p>
         </w:tc>

</xml_diff>